<commit_message>
fix(docs): static contents list in C&D doc — TOC field rendered blank outside Word
Co-Authored-By: Claude Fable 5 <noreply@anthropic.com>
</commit_message>
<xml_diff>
--- a/docs/product/FinDesk_Concept_and_Design.docx
+++ b/docs/product/FinDesk_Concept_and_Design.docx
@@ -520,25 +520,281 @@
         <w:t xml:space="preserve">Contents</w:t>
       </w:r>
     </w:p>
-    <w:sdt>
-      <w:sdtPr>
-        <w:alias w:val="Table of Contents"/>
-      </w:sdtPr>
-      <w:sdtContent>
-        <w:p>
-          <w:r>
-            <w:fldChar w:fldCharType="begin" w:dirty="true"/>
-            <w:instrText xml:space="preserve">TOC \h \o "1-2"</w:instrText>
-            <w:fldChar w:fldCharType="separate"/>
-          </w:r>
-        </w:p>
-        <w:p>
-          <w:r>
-            <w:fldChar w:fldCharType="end"/>
-          </w:r>
-        </w:p>
-      </w:sdtContent>
-    </w:sdt>
+    <w:p>
+      <w:pPr>
+        <w:tabs>
+          <w:tab w:val="right" w:pos="9026" w:leader="dot"/>
+        </w:tabs>
+        <w:spacing w:after="120"/>
+      </w:pPr>
+      <w:r>
+        <w:rPr>
+          <w:rFonts w:ascii="Arial" w:cs="Arial" w:eastAsia="Arial" w:hAnsi="Arial"/>
+          <w:sz w:val="23"/>
+          <w:szCs w:val="23"/>
+        </w:rPr>
+        <w:t xml:space="preserve">1.  Concept</w:t>
+      </w:r>
+      <w:r>
+        <w:rPr>
+          <w:rFonts w:ascii="Arial" w:cs="Arial" w:eastAsia="Arial" w:hAnsi="Arial"/>
+          <w:color w:val="64748B"/>
+          <w:sz w:val="23"/>
+          <w:szCs w:val="23"/>
+        </w:rPr>
+        <w:t xml:space="preserve">	3</w:t>
+      </w:r>
+    </w:p>
+    <w:p>
+      <w:pPr>
+        <w:tabs>
+          <w:tab w:val="right" w:pos="9026" w:leader="dot"/>
+        </w:tabs>
+        <w:spacing w:after="120"/>
+      </w:pPr>
+      <w:r>
+        <w:rPr>
+          <w:rFonts w:ascii="Arial" w:cs="Arial" w:eastAsia="Arial" w:hAnsi="Arial"/>
+          <w:sz w:val="23"/>
+          <w:szCs w:val="23"/>
+        </w:rPr>
+        <w:t xml:space="preserve">2.  Delivered Feature Set</w:t>
+      </w:r>
+      <w:r>
+        <w:rPr>
+          <w:rFonts w:ascii="Arial" w:cs="Arial" w:eastAsia="Arial" w:hAnsi="Arial"/>
+          <w:color w:val="64748B"/>
+          <w:sz w:val="23"/>
+          <w:szCs w:val="23"/>
+        </w:rPr>
+        <w:t xml:space="preserve">	4</w:t>
+      </w:r>
+    </w:p>
+    <w:p>
+      <w:pPr>
+        <w:tabs>
+          <w:tab w:val="right" w:pos="9026" w:leader="dot"/>
+        </w:tabs>
+        <w:spacing w:after="120"/>
+      </w:pPr>
+      <w:r>
+        <w:rPr>
+          <w:rFonts w:ascii="Arial" w:cs="Arial" w:eastAsia="Arial" w:hAnsi="Arial"/>
+          <w:sz w:val="23"/>
+          <w:szCs w:val="23"/>
+        </w:rPr>
+        <w:t xml:space="preserve">3.  System Design</w:t>
+      </w:r>
+      <w:r>
+        <w:rPr>
+          <w:rFonts w:ascii="Arial" w:cs="Arial" w:eastAsia="Arial" w:hAnsi="Arial"/>
+          <w:color w:val="64748B"/>
+          <w:sz w:val="23"/>
+          <w:szCs w:val="23"/>
+        </w:rPr>
+        <w:t xml:space="preserve">	5</w:t>
+      </w:r>
+    </w:p>
+    <w:p>
+      <w:pPr>
+        <w:tabs>
+          <w:tab w:val="right" w:pos="9026" w:leader="dot"/>
+        </w:tabs>
+        <w:spacing w:after="120"/>
+      </w:pPr>
+      <w:r>
+        <w:rPr>
+          <w:rFonts w:ascii="Arial" w:cs="Arial" w:eastAsia="Arial" w:hAnsi="Arial"/>
+          <w:sz w:val="23"/>
+          <w:szCs w:val="23"/>
+        </w:rPr>
+        <w:t xml:space="preserve">4.  Key Design Decisions</w:t>
+      </w:r>
+      <w:r>
+        <w:rPr>
+          <w:rFonts w:ascii="Arial" w:cs="Arial" w:eastAsia="Arial" w:hAnsi="Arial"/>
+          <w:color w:val="64748B"/>
+          <w:sz w:val="23"/>
+          <w:szCs w:val="23"/>
+        </w:rPr>
+        <w:t xml:space="preserve">	7</w:t>
+      </w:r>
+    </w:p>
+    <w:p>
+      <w:pPr>
+        <w:tabs>
+          <w:tab w:val="right" w:pos="9026" w:leader="dot"/>
+        </w:tabs>
+        <w:spacing w:after="120"/>
+      </w:pPr>
+      <w:r>
+        <w:rPr>
+          <w:rFonts w:ascii="Arial" w:cs="Arial" w:eastAsia="Arial" w:hAnsi="Arial"/>
+          <w:sz w:val="23"/>
+          <w:szCs w:val="23"/>
+        </w:rPr>
+        <w:t xml:space="preserve">5.  Trust, Compliance &amp; the Data Room</w:t>
+      </w:r>
+      <w:r>
+        <w:rPr>
+          <w:rFonts w:ascii="Arial" w:cs="Arial" w:eastAsia="Arial" w:hAnsi="Arial"/>
+          <w:color w:val="64748B"/>
+          <w:sz w:val="23"/>
+          <w:szCs w:val="23"/>
+        </w:rPr>
+        <w:t xml:space="preserve">	9</w:t>
+      </w:r>
+    </w:p>
+    <w:p>
+      <w:pPr>
+        <w:tabs>
+          <w:tab w:val="right" w:pos="9026" w:leader="dot"/>
+        </w:tabs>
+        <w:spacing w:after="120"/>
+      </w:pPr>
+      <w:r>
+        <w:rPr>
+          <w:rFonts w:ascii="Arial" w:cs="Arial" w:eastAsia="Arial" w:hAnsi="Arial"/>
+          <w:sz w:val="23"/>
+          <w:szCs w:val="23"/>
+        </w:rPr>
+        <w:t xml:space="preserve">6.  Data Design</w:t>
+      </w:r>
+      <w:r>
+        <w:rPr>
+          <w:rFonts w:ascii="Arial" w:cs="Arial" w:eastAsia="Arial" w:hAnsi="Arial"/>
+          <w:color w:val="64748B"/>
+          <w:sz w:val="23"/>
+          <w:szCs w:val="23"/>
+        </w:rPr>
+        <w:t xml:space="preserve">	9</w:t>
+      </w:r>
+    </w:p>
+    <w:p>
+      <w:pPr>
+        <w:tabs>
+          <w:tab w:val="right" w:pos="9026" w:leader="dot"/>
+        </w:tabs>
+        <w:spacing w:after="120"/>
+      </w:pPr>
+      <w:r>
+        <w:rPr>
+          <w:rFonts w:ascii="Arial" w:cs="Arial" w:eastAsia="Arial" w:hAnsi="Arial"/>
+          <w:sz w:val="23"/>
+          <w:szCs w:val="23"/>
+        </w:rPr>
+        <w:t xml:space="preserve">7.  Quality &amp; Verification</w:t>
+      </w:r>
+      <w:r>
+        <w:rPr>
+          <w:rFonts w:ascii="Arial" w:cs="Arial" w:eastAsia="Arial" w:hAnsi="Arial"/>
+          <w:color w:val="64748B"/>
+          <w:sz w:val="23"/>
+          <w:szCs w:val="23"/>
+        </w:rPr>
+        <w:t xml:space="preserve">	9</w:t>
+      </w:r>
+    </w:p>
+    <w:p>
+      <w:pPr>
+        <w:tabs>
+          <w:tab w:val="right" w:pos="9026" w:leader="dot"/>
+        </w:tabs>
+        <w:spacing w:after="120"/>
+      </w:pPr>
+      <w:r>
+        <w:rPr>
+          <w:rFonts w:ascii="Arial" w:cs="Arial" w:eastAsia="Arial" w:hAnsi="Arial"/>
+          <w:sz w:val="23"/>
+          <w:szCs w:val="23"/>
+        </w:rPr>
+        <w:t xml:space="preserve">8.  Delivery Summary</w:t>
+      </w:r>
+      <w:r>
+        <w:rPr>
+          <w:rFonts w:ascii="Arial" w:cs="Arial" w:eastAsia="Arial" w:hAnsi="Arial"/>
+          <w:color w:val="64748B"/>
+          <w:sz w:val="23"/>
+          <w:szCs w:val="23"/>
+        </w:rPr>
+        <w:t xml:space="preserve">	10</w:t>
+      </w:r>
+    </w:p>
+    <w:p>
+      <w:pPr>
+        <w:tabs>
+          <w:tab w:val="right" w:pos="9026" w:leader="dot"/>
+        </w:tabs>
+        <w:spacing w:after="120"/>
+      </w:pPr>
+      <w:r>
+        <w:rPr>
+          <w:rFonts w:ascii="Arial" w:cs="Arial" w:eastAsia="Arial" w:hAnsi="Arial"/>
+          <w:sz w:val="23"/>
+          <w:szCs w:val="23"/>
+        </w:rPr>
+        <w:t xml:space="preserve">9.  Production Roadmap</w:t>
+      </w:r>
+      <w:r>
+        <w:rPr>
+          <w:rFonts w:ascii="Arial" w:cs="Arial" w:eastAsia="Arial" w:hAnsi="Arial"/>
+          <w:color w:val="64748B"/>
+          <w:sz w:val="23"/>
+          <w:szCs w:val="23"/>
+        </w:rPr>
+        <w:t xml:space="preserve">	10</w:t>
+      </w:r>
+    </w:p>
+    <w:p>
+      <w:pPr>
+        <w:tabs>
+          <w:tab w:val="right" w:pos="9026" w:leader="dot"/>
+        </w:tabs>
+        <w:spacing w:after="120"/>
+      </w:pPr>
+      <w:r>
+        <w:rPr>
+          <w:rFonts w:ascii="Arial" w:cs="Arial" w:eastAsia="Arial" w:hAnsi="Arial"/>
+          <w:sz w:val="23"/>
+          <w:szCs w:val="23"/>
+        </w:rPr>
+        <w:t xml:space="preserve">Appendix A — Technology Stack</w:t>
+      </w:r>
+      <w:r>
+        <w:rPr>
+          <w:rFonts w:ascii="Arial" w:cs="Arial" w:eastAsia="Arial" w:hAnsi="Arial"/>
+          <w:color w:val="64748B"/>
+          <w:sz w:val="23"/>
+          <w:szCs w:val="23"/>
+        </w:rPr>
+        <w:t xml:space="preserve">	10</w:t>
+      </w:r>
+    </w:p>
+    <w:p>
+      <w:pPr>
+        <w:tabs>
+          <w:tab w:val="right" w:pos="9026" w:leader="dot"/>
+        </w:tabs>
+        <w:spacing w:after="120"/>
+      </w:pPr>
+      <w:r>
+        <w:rPr>
+          <w:rFonts w:ascii="Arial" w:cs="Arial" w:eastAsia="Arial" w:hAnsi="Arial"/>
+          <w:sz w:val="23"/>
+          <w:szCs w:val="23"/>
+        </w:rPr>
+        <w:t xml:space="preserve">Appendix B — Five-Minute Demo Path</w:t>
+      </w:r>
+      <w:r>
+        <w:rPr>
+          <w:rFonts w:ascii="Arial" w:cs="Arial" w:eastAsia="Arial" w:hAnsi="Arial"/>
+          <w:color w:val="64748B"/>
+          <w:sz w:val="23"/>
+          <w:szCs w:val="23"/>
+        </w:rPr>
+        <w:t xml:space="preserve">	11</w:t>
+      </w:r>
+    </w:p>
     <w:p>
       <w:r>
         <w:br w:type="page"/>

</xml_diff>